<commit_message>
Fixed login UI and Excel export bug
</commit_message>
<xml_diff>
--- a/school_timetable.docx
+++ b/school_timetable.docx
@@ -1614,7 +1614,9 @@
             <w:tcW w:type="dxa" w:w="245"/>
           </w:tcPr>
           <w:p>
-            <w:r/>
+            <w:r>
+              <w:t>6E ENGLISH</w:t>
+            </w:r>
           </w:p>
         </w:tc>
         <w:tc>
@@ -1714,9 +1716,7 @@
             <w:tcW w:type="dxa" w:w="245"/>
           </w:tcPr>
           <w:p>
-            <w:r>
-              <w:t>6E ARABIC</w:t>
-            </w:r>
+            <w:r/>
           </w:p>
         </w:tc>
         <w:tc>
@@ -2072,9 +2072,7 @@
             <w:tcW w:type="dxa" w:w="245"/>
           </w:tcPr>
           <w:p>
-            <w:r>
-              <w:t>6B ENGLISH</w:t>
-            </w:r>
+            <w:r/>
           </w:p>
         </w:tc>
         <w:tc>
@@ -2102,7 +2100,9 @@
             <w:tcW w:type="dxa" w:w="245"/>
           </w:tcPr>
           <w:p>
-            <w:r/>
+            <w:r>
+              <w:t>6B URDU</w:t>
+            </w:r>
           </w:p>
         </w:tc>
         <w:tc>
@@ -3851,7 +3851,7 @@
           </w:tcPr>
           <w:p>
             <w:r>
-              <w:t>6E ENGLISH</w:t>
+              <w:t>6B ENGLISH</w:t>
             </w:r>
           </w:p>
         </w:tc>
@@ -3878,19 +3878,15 @@
             <w:tcW w:type="dxa" w:w="245"/>
           </w:tcPr>
           <w:p>
-            <w:r>
-              <w:t>6B URDU</w:t>
-            </w:r>
-          </w:p>
-        </w:tc>
-        <w:tc>
-          <w:tcPr>
-            <w:tcW w:type="dxa" w:w="245"/>
-          </w:tcPr>
-          <w:p>
-            <w:r>
-              <w:t>7A COMPUTER</w:t>
-            </w:r>
+            <w:r/>
+          </w:p>
+        </w:tc>
+        <w:tc>
+          <w:tcPr>
+            <w:tcW w:type="dxa" w:w="245"/>
+          </w:tcPr>
+          <w:p>
+            <w:r/>
           </w:p>
         </w:tc>
         <w:tc>
@@ -3954,7 +3950,9 @@
             <w:tcW w:type="dxa" w:w="245"/>
           </w:tcPr>
           <w:p>
-            <w:r/>
+            <w:r>
+              <w:t>6E ARABIC</w:t>
+            </w:r>
           </w:p>
         </w:tc>
         <w:tc>
@@ -4048,7 +4046,9 @@
             <w:tcW w:type="dxa" w:w="245"/>
           </w:tcPr>
           <w:p>
-            <w:r/>
+            <w:r>
+              <w:t>9A LIBRARY</w:t>
+            </w:r>
           </w:p>
         </w:tc>
         <w:tc>
@@ -4126,40 +4126,42 @@
             <w:tcW w:type="dxa" w:w="245"/>
           </w:tcPr>
           <w:p>
-            <w:r/>
-          </w:p>
-        </w:tc>
-        <w:tc>
-          <w:tcPr>
-            <w:tcW w:type="dxa" w:w="245"/>
-          </w:tcPr>
-          <w:p>
-            <w:r/>
-          </w:p>
-        </w:tc>
-        <w:tc>
-          <w:tcPr>
-            <w:tcW w:type="dxa" w:w="245"/>
-          </w:tcPr>
-          <w:p>
-            <w:r/>
-          </w:p>
-        </w:tc>
-        <w:tc>
-          <w:tcPr>
-            <w:tcW w:type="dxa" w:w="245"/>
-          </w:tcPr>
-          <w:p>
-            <w:r/>
-          </w:p>
-        </w:tc>
-        <w:tc>
-          <w:tcPr>
-            <w:tcW w:type="dxa" w:w="245"/>
-          </w:tcPr>
-          <w:p>
-            <w:r>
-              <w:t>9A GAMES</w:t>
+            <w:r>
+              <w:t>7A HISTORY</w:t>
+            </w:r>
+          </w:p>
+        </w:tc>
+        <w:tc>
+          <w:tcPr>
+            <w:tcW w:type="dxa" w:w="245"/>
+          </w:tcPr>
+          <w:p>
+            <w:r/>
+          </w:p>
+        </w:tc>
+        <w:tc>
+          <w:tcPr>
+            <w:tcW w:type="dxa" w:w="245"/>
+          </w:tcPr>
+          <w:p>
+            <w:r/>
+          </w:p>
+        </w:tc>
+        <w:tc>
+          <w:tcPr>
+            <w:tcW w:type="dxa" w:w="245"/>
+          </w:tcPr>
+          <w:p>
+            <w:r/>
+          </w:p>
+        </w:tc>
+        <w:tc>
+          <w:tcPr>
+            <w:tcW w:type="dxa" w:w="245"/>
+          </w:tcPr>
+          <w:p>
+            <w:r>
+              <w:t>9B GAMES</w:t>
             </w:r>
           </w:p>
         </w:tc>
@@ -4342,7 +4344,9 @@
             <w:tcW w:type="dxa" w:w="245"/>
           </w:tcPr>
           <w:p>
-            <w:r/>
+            <w:r>
+              <w:t>7A COMPUTER</w:t>
+            </w:r>
           </w:p>
         </w:tc>
         <w:tc>
@@ -4582,59 +4586,57 @@
             <w:tcW w:type="dxa" w:w="245"/>
           </w:tcPr>
           <w:p>
-            <w:r>
-              <w:t>7A HISTORY</w:t>
-            </w:r>
-          </w:p>
-        </w:tc>
-        <w:tc>
-          <w:tcPr>
-            <w:tcW w:type="dxa" w:w="245"/>
-          </w:tcPr>
-          <w:p>
-            <w:r/>
-          </w:p>
-        </w:tc>
-        <w:tc>
-          <w:tcPr>
-            <w:tcW w:type="dxa" w:w="245"/>
-          </w:tcPr>
-          <w:p>
-            <w:r/>
-          </w:p>
-        </w:tc>
-        <w:tc>
-          <w:tcPr>
-            <w:tcW w:type="dxa" w:w="245"/>
-          </w:tcPr>
-          <w:p>
-            <w:r/>
-          </w:p>
-        </w:tc>
-        <w:tc>
-          <w:tcPr>
-            <w:tcW w:type="dxa" w:w="245"/>
-          </w:tcPr>
-          <w:p>
-            <w:r/>
-          </w:p>
-        </w:tc>
-        <w:tc>
-          <w:tcPr>
-            <w:tcW w:type="dxa" w:w="245"/>
-          </w:tcPr>
-          <w:p>
-            <w:r>
-              <w:t>6B GAMES</w:t>
-            </w:r>
-          </w:p>
-        </w:tc>
-        <w:tc>
-          <w:tcPr>
-            <w:tcW w:type="dxa" w:w="245"/>
-          </w:tcPr>
-          <w:p>
-            <w:r/>
+            <w:r/>
+          </w:p>
+        </w:tc>
+        <w:tc>
+          <w:tcPr>
+            <w:tcW w:type="dxa" w:w="245"/>
+          </w:tcPr>
+          <w:p>
+            <w:r/>
+          </w:p>
+        </w:tc>
+        <w:tc>
+          <w:tcPr>
+            <w:tcW w:type="dxa" w:w="245"/>
+          </w:tcPr>
+          <w:p>
+            <w:r/>
+          </w:p>
+        </w:tc>
+        <w:tc>
+          <w:tcPr>
+            <w:tcW w:type="dxa" w:w="245"/>
+          </w:tcPr>
+          <w:p>
+            <w:r/>
+          </w:p>
+        </w:tc>
+        <w:tc>
+          <w:tcPr>
+            <w:tcW w:type="dxa" w:w="245"/>
+          </w:tcPr>
+          <w:p>
+            <w:r/>
+          </w:p>
+        </w:tc>
+        <w:tc>
+          <w:tcPr>
+            <w:tcW w:type="dxa" w:w="245"/>
+          </w:tcPr>
+          <w:p>
+            <w:r/>
+          </w:p>
+        </w:tc>
+        <w:tc>
+          <w:tcPr>
+            <w:tcW w:type="dxa" w:w="245"/>
+          </w:tcPr>
+          <w:p>
+            <w:r>
+              <w:t>6B AI</w:t>
+            </w:r>
           </w:p>
         </w:tc>
       </w:tr>
@@ -7028,17 +7030,17 @@
             <w:tcW w:type="dxa" w:w="245"/>
           </w:tcPr>
           <w:p>
-            <w:r/>
-          </w:p>
-        </w:tc>
-        <w:tc>
-          <w:tcPr>
-            <w:tcW w:type="dxa" w:w="245"/>
-          </w:tcPr>
-          <w:p>
-            <w:r>
-              <w:t>6B AI</w:t>
-            </w:r>
+            <w:r>
+              <w:t>6B GAMES</w:t>
+            </w:r>
+          </w:p>
+        </w:tc>
+        <w:tc>
+          <w:tcPr>
+            <w:tcW w:type="dxa" w:w="245"/>
+          </w:tcPr>
+          <w:p>
+            <w:r/>
           </w:p>
         </w:tc>
       </w:tr>
@@ -10464,7 +10466,9 @@
             <w:tcW w:type="dxa" w:w="245"/>
           </w:tcPr>
           <w:p>
-            <w:r/>
+            <w:r>
+              <w:t>7E COMPUTER</w:t>
+            </w:r>
           </w:p>
         </w:tc>
         <w:tc>
@@ -10750,9 +10754,7 @@
             <w:tcW w:type="dxa" w:w="245"/>
           </w:tcPr>
           <w:p>
-            <w:r>
-              <w:t>7E GAMES</w:t>
-            </w:r>
+            <w:r/>
           </w:p>
         </w:tc>
         <w:tc>
@@ -12244,9 +12246,7 @@
             <w:tcW w:type="dxa" w:w="245"/>
           </w:tcPr>
           <w:p>
-            <w:r>
-              <w:t>7E COMPUTER</w:t>
-            </w:r>
+            <w:r/>
           </w:p>
         </w:tc>
         <w:tc>
@@ -12274,7 +12274,9 @@
             <w:tcW w:type="dxa" w:w="245"/>
           </w:tcPr>
           <w:p>
-            <w:r/>
+            <w:r>
+              <w:t>9A ENGLISH</w:t>
+            </w:r>
           </w:p>
         </w:tc>
         <w:tc>
@@ -12400,9 +12402,7 @@
             <w:tcW w:type="dxa" w:w="245"/>
           </w:tcPr>
           <w:p>
-            <w:r>
-              <w:t>9A LIBRARY</w:t>
-            </w:r>
+            <w:r/>
           </w:p>
         </w:tc>
         <w:tc>
@@ -12530,7 +12530,9 @@
             <w:tcW w:type="dxa" w:w="245"/>
           </w:tcPr>
           <w:p>
-            <w:r/>
+            <w:r>
+              <w:t>7E GAMES</w:t>
+            </w:r>
           </w:p>
         </w:tc>
         <w:tc>
@@ -12730,9 +12732,7 @@
             <w:tcW w:type="dxa" w:w="245"/>
           </w:tcPr>
           <w:p>
-            <w:r>
-              <w:t>9A ENGLISH</w:t>
-            </w:r>
+            <w:r/>
           </w:p>
         </w:tc>
         <w:tc>
@@ -12980,7 +12980,9 @@
             <w:tcW w:type="dxa" w:w="245"/>
           </w:tcPr>
           <w:p>
-            <w:r/>
+            <w:r>
+              <w:t>9A GAMES</w:t>
+            </w:r>
           </w:p>
         </w:tc>
         <w:tc>
@@ -15896,9 +15898,7 @@
             <w:tcW w:type="dxa" w:w="245"/>
           </w:tcPr>
           <w:p>
-            <w:r>
-              <w:t>6A ENGLISH</w:t>
-            </w:r>
+            <w:r/>
           </w:p>
         </w:tc>
         <w:tc>
@@ -16024,7 +16024,9 @@
             <w:tcW w:type="dxa" w:w="245"/>
           </w:tcPr>
           <w:p>
-            <w:r/>
+            <w:r>
+              <w:t>6A COMPUTER</w:t>
+            </w:r>
           </w:p>
         </w:tc>
         <w:tc>
@@ -17217,7 +17219,7 @@
           </w:tcPr>
           <w:p>
             <w:r>
-              <w:t>7D ENGLISH</w:t>
+              <w:t>6A ENGLISH</w:t>
             </w:r>
           </w:p>
         </w:tc>
@@ -17344,9 +17346,7 @@
             <w:tcW w:type="dxa" w:w="245"/>
           </w:tcPr>
           <w:p>
-            <w:r>
-              <w:t>6A COMPUTER</w:t>
-            </w:r>
+            <w:r/>
           </w:p>
         </w:tc>
         <w:tc>
@@ -17628,7 +17628,9 @@
             <w:tcW w:type="dxa" w:w="245"/>
           </w:tcPr>
           <w:p>
-            <w:r/>
+            <w:r>
+              <w:t>7D GAMES</w:t>
+            </w:r>
           </w:p>
         </w:tc>
         <w:tc>
@@ -17846,9 +17848,7 @@
             <w:tcW w:type="dxa" w:w="245"/>
           </w:tcPr>
           <w:p>
-            <w:r>
-              <w:t>7D ISLAMIAT</w:t>
-            </w:r>
+            <w:r/>
           </w:p>
         </w:tc>
         <w:tc>
@@ -18054,7 +18054,9 @@
             <w:tcW w:type="dxa" w:w="245"/>
           </w:tcPr>
           <w:p>
-            <w:r/>
+            <w:r>
+              <w:t>7D SINDHI</w:t>
+            </w:r>
           </w:p>
         </w:tc>
         <w:tc>
@@ -18132,7 +18134,9 @@
             <w:tcW w:type="dxa" w:w="245"/>
           </w:tcPr>
           <w:p>
-            <w:r/>
+            <w:r>
+              <w:t>7D ENGLISH</w:t>
+            </w:r>
           </w:p>
         </w:tc>
         <w:tc>
@@ -18542,9 +18546,7 @@
             <w:tcW w:type="dxa" w:w="245"/>
           </w:tcPr>
           <w:p>
-            <w:r>
-              <w:t>7D GAMES</w:t>
-            </w:r>
+            <w:r/>
           </w:p>
         </w:tc>
         <w:tc>
@@ -19256,7 +19258,9 @@
             <w:tcW w:type="dxa" w:w="245"/>
           </w:tcPr>
           <w:p>
-            <w:r/>
+            <w:r>
+              <w:t>7E ENGLISH</w:t>
+            </w:r>
           </w:p>
         </w:tc>
         <w:tc>
@@ -19358,9 +19362,7 @@
             <w:tcW w:type="dxa" w:w="245"/>
           </w:tcPr>
           <w:p>
-            <w:r>
-              <w:t>7E ARABIC</w:t>
-            </w:r>
+            <w:r/>
           </w:p>
         </w:tc>
         <w:tc>
@@ -19714,9 +19716,7 @@
             <w:tcW w:type="dxa" w:w="245"/>
           </w:tcPr>
           <w:p>
-            <w:r>
-              <w:t>7E ENGLISH</w:t>
-            </w:r>
+            <w:r/>
           </w:p>
         </w:tc>
         <w:tc>
@@ -19816,7 +19816,9 @@
             <w:tcW w:type="dxa" w:w="245"/>
           </w:tcPr>
           <w:p>
-            <w:r/>
+            <w:r>
+              <w:t>7E ARABIC</w:t>
+            </w:r>
           </w:p>
         </w:tc>
         <w:tc>
@@ -21578,7 +21580,9 @@
             <w:tcW w:type="dxa" w:w="245"/>
           </w:tcPr>
           <w:p>
-            <w:r/>
+            <w:r>
+              <w:t>7D ISLAMIAT</w:t>
+            </w:r>
           </w:p>
         </w:tc>
         <w:tc>
@@ -21776,9 +21780,7 @@
             <w:tcW w:type="dxa" w:w="245"/>
           </w:tcPr>
           <w:p>
-            <w:r>
-              <w:t>7D SINDHI</w:t>
-            </w:r>
+            <w:r/>
           </w:p>
         </w:tc>
         <w:tc>

</xml_diff>